<commit_message>
Support distinct India and US baseline resumes with regional contact details and tailored docs
</commit_message>
<xml_diff>
--- a/VipulSapra_Resume.docx
+++ b/VipulSapra_Resume.docx
@@ -130,9 +130,7 @@
         <w:spacing w:before="51"/>
         <w:ind w:left="139"/>
         <w:rPr>
-          <w:rFonts w:hint="default"/>
-          <w:b/>
-          <w:lang w:val="en-US"/>
+          <w:b/>
         </w:rPr>
       </w:pPr>
       <w:r>
@@ -232,7 +230,7 @@
           <w:rFonts w:hint="default"/>
           <w:lang w:val="en-US"/>
         </w:rPr>
-        <w:t xml:space="preserve"> </w:t>
+        <w:t xml:space="preserve">  </w:t>
       </w:r>
     </w:p>
     <w:p>
@@ -596,6 +594,13 @@
       </w:r>
       <w:r>
         <w:rPr>
+          <w:rFonts w:hint="default" w:asciiTheme="minorHAnsi" w:hAnsiTheme="minorHAnsi" w:cstheme="minorHAnsi"/>
+          <w:lang w:val="en-US"/>
+        </w:rPr>
+        <w:t xml:space="preserve">Agentic AI powered KIRO IDE, </w:t>
+      </w:r>
+      <w:r>
+        <w:rPr>
           <w:rFonts w:asciiTheme="minorHAnsi" w:hAnsiTheme="minorHAnsi" w:cstheme="minorHAnsi"/>
         </w:rPr>
         <w:t xml:space="preserve">SQL, Python, </w:t>
@@ -654,23 +659,10 @@
       </w:r>
       <w:r>
         <w:rPr>
-          <w:rFonts w:asciiTheme="minorHAnsi" w:hAnsiTheme="minorHAnsi" w:cstheme="minorHAnsi"/>
-          <w:bCs/>
-        </w:rPr>
-        <w:t xml:space="preserve"> </w:t>
-      </w:r>
-      <w:r>
-        <w:rPr>
-          <w:rFonts w:asciiTheme="minorHAnsi" w:hAnsiTheme="minorHAnsi" w:cstheme="minorHAnsi"/>
-        </w:rPr>
-        <w:t xml:space="preserve">Microsoft Excel, </w:t>
-      </w:r>
-      <w:r>
-        <w:rPr>
           <w:rFonts w:hint="default" w:asciiTheme="minorHAnsi" w:hAnsiTheme="minorHAnsi" w:cstheme="minorHAnsi"/>
           <w:lang w:val="en-US"/>
         </w:rPr>
-        <w:t xml:space="preserve"> Agentic AI powered KIRO IDE, </w:t>
+        <w:t xml:space="preserve"> </w:t>
       </w:r>
       <w:r>
         <w:rPr>
@@ -717,7 +709,20 @@
           <w:rFonts w:hint="default" w:asciiTheme="minorHAnsi" w:hAnsiTheme="minorHAnsi" w:cstheme="minorHAnsi"/>
           <w:lang w:val="en-US"/>
         </w:rPr>
-        <w:t xml:space="preserve"> Airflow.</w:t>
+        <w:t xml:space="preserve"> Airflow, </w:t>
+      </w:r>
+      <w:r>
+        <w:rPr>
+          <w:rFonts w:asciiTheme="minorHAnsi" w:hAnsiTheme="minorHAnsi" w:cstheme="minorHAnsi"/>
+        </w:rPr>
+        <w:t>Microsoft Excel</w:t>
+      </w:r>
+      <w:r>
+        <w:rPr>
+          <w:rFonts w:hint="default" w:asciiTheme="minorHAnsi" w:hAnsiTheme="minorHAnsi" w:cstheme="minorHAnsi"/>
+          <w:lang w:val="en-US"/>
+        </w:rPr>
+        <w:t>.</w:t>
       </w:r>
     </w:p>
     <w:p>
@@ -902,7 +907,7 @@
           <w:bCs/>
           <w:lang w:val="en-US" w:bidi="ar-SA"/>
         </w:rPr>
-        <w:t xml:space="preserve">Data Scientist </w:t>
+        <w:t xml:space="preserve">Data Scientist &amp; AI Engineer </w:t>
       </w:r>
       <w:r>
         <w:rPr>
@@ -936,7 +941,7 @@
           <w:rFonts w:eastAsiaTheme="minorHAnsi"/>
           <w:lang w:bidi="ar-SA"/>
         </w:rPr>
-        <w:t xml:space="preserve">                                      </w:t>
+        <w:t xml:space="preserve">               </w:t>
       </w:r>
       <w:r>
         <w:rPr>
@@ -993,33 +998,47 @@
           <w:sz w:val="22"/>
           <w:szCs w:val="22"/>
         </w:rPr>
-        <w:t>Built and deployed XGBoost classification models</w:t>
-      </w:r>
-      <w:r>
-        <w:rPr>
-          <w:rFonts w:hint="default" w:ascii="Calibri" w:hAnsi="Calibri" w:cs="Calibri"/>
-          <w:sz w:val="22"/>
-          <w:szCs w:val="22"/>
-        </w:rPr>
-        <w:t xml:space="preserve"> to predict customer support-seeking behaviors and repair calls, contributing to a </w:t>
-      </w:r>
-      <w:r>
-        <w:rPr>
-          <w:rFonts w:hint="default" w:ascii="Calibri" w:hAnsi="Calibri" w:cs="Calibri"/>
-          <w:b/>
-          <w:bCs/>
-          <w:sz w:val="22"/>
-          <w:szCs w:val="22"/>
-        </w:rPr>
-        <w:t>20% improvement in service reliability.</w:t>
-      </w:r>
-      <w:r>
-        <w:rPr>
-          <w:rFonts w:hint="default" w:ascii="Calibri" w:hAnsi="Calibri" w:eastAsia="SimSun" w:cs="Calibri"/>
-          <w:sz w:val="22"/>
-          <w:szCs w:val="22"/>
-        </w:rPr>
-        <w:t xml:space="preserve">  </w:t>
+        <w:t>Engineered an enterprise AI-driven reporting platform</w:t>
+      </w:r>
+      <w:r>
+        <w:rPr>
+          <w:rFonts w:hint="default" w:ascii="Calibri" w:hAnsi="Calibri" w:cs="Calibri"/>
+          <w:sz w:val="22"/>
+          <w:szCs w:val="22"/>
+        </w:rPr>
+        <w:t xml:space="preserve"> that autonomously answers ad-hoc data questions, streamlining scheduled report delivery and reducing manual reporting turnaround for business stakeholders.</w:t>
+      </w:r>
+      <w:r>
+        <w:rPr>
+          <w:rFonts w:hint="default" w:ascii="Calibri" w:hAnsi="Calibri" w:cs="Calibri"/>
+          <w:b w:val="0"/>
+          <w:bCs w:val="0"/>
+          <w:sz w:val="22"/>
+          <w:szCs w:val="22"/>
+          <w:lang w:val="en-US"/>
+        </w:rPr>
+        <w:t xml:space="preserve"> </w:t>
+      </w:r>
+      <w:r>
+        <w:rPr>
+          <w:rFonts w:hint="default" w:asciiTheme="minorHAnsi" w:hAnsiTheme="minorHAnsi" w:cstheme="minorHAnsi"/>
+          <w:b/>
+          <w:bCs/>
+          <w:sz w:val="22"/>
+          <w:szCs w:val="22"/>
+          <w:lang w:val="en-US"/>
+        </w:rPr>
+        <w:t>Agentic AI powered KIRO IDE</w:t>
+      </w:r>
+      <w:r>
+        <w:rPr>
+          <w:rFonts w:hint="default" w:ascii="Calibri" w:hAnsi="Calibri" w:cs="Calibri"/>
+          <w:b w:val="0"/>
+          <w:bCs w:val="0"/>
+          <w:sz w:val="22"/>
+          <w:szCs w:val="22"/>
+        </w:rPr>
+        <w:t>.</w:t>
       </w:r>
     </w:p>
     <w:p>
@@ -1035,47 +1054,57 @@
         <w:suppressLineNumbers w:val="0"/>
         <w:ind w:left="420" w:leftChars="0" w:hanging="420" w:firstLineChars="0"/>
         <w:rPr>
-          <w:rFonts w:asciiTheme="minorHAnsi" w:hAnsiTheme="minorHAnsi" w:eastAsiaTheme="minorHAnsi" w:cstheme="minorHAnsi"/>
-          <w:b/>
-          <w:bCs/>
-          <w:lang w:bidi="ar-SA"/>
-        </w:rPr>
-      </w:pPr>
-      <w:r>
-        <w:rPr>
-          <w:rFonts w:hint="default" w:ascii="Calibri" w:hAnsi="Calibri" w:cs="Calibri"/>
-          <w:b/>
-          <w:bCs/>
-          <w:sz w:val="22"/>
-          <w:szCs w:val="22"/>
-        </w:rPr>
-        <w:t>Developed proactive anomaly detection systems</w:t>
-      </w:r>
-      <w:r>
-        <w:rPr>
-          <w:rFonts w:hint="default" w:ascii="Calibri" w:hAnsi="Calibri" w:cs="Calibri"/>
-          <w:sz w:val="22"/>
-          <w:szCs w:val="22"/>
-        </w:rPr>
-        <w:t xml:space="preserve"> using machine learning to identify data discrepancies with </w:t>
-      </w:r>
-      <w:r>
-        <w:rPr>
-          <w:rFonts w:hint="default" w:ascii="Calibri" w:hAnsi="Calibri" w:cs="Calibri"/>
-          <w:b/>
-          <w:bCs/>
-          <w:sz w:val="22"/>
-          <w:szCs w:val="22"/>
-        </w:rPr>
-        <w:t>95% accuracy</w:t>
-      </w:r>
-      <w:r>
-        <w:rPr>
-          <w:rFonts w:hint="default" w:ascii="Calibri" w:hAnsi="Calibri" w:cs="Calibri"/>
-          <w:sz w:val="22"/>
-          <w:szCs w:val="22"/>
-        </w:rPr>
-        <w:t>, significantly reducing downstream reporting errors.</w:t>
+          <w:rFonts w:hint="default" w:ascii="Calibri" w:hAnsi="Calibri" w:cs="Calibri"/>
+          <w:sz w:val="22"/>
+          <w:szCs w:val="22"/>
+        </w:rPr>
+      </w:pPr>
+      <w:r>
+        <w:rPr>
+          <w:rFonts w:hint="default" w:ascii="Calibri" w:hAnsi="Calibri" w:cs="Calibri"/>
+          <w:b/>
+          <w:bCs/>
+          <w:sz w:val="22"/>
+          <w:szCs w:val="22"/>
+        </w:rPr>
+        <w:t>Engineered a custom Data Profiler tool</w:t>
+      </w:r>
+      <w:r>
+        <w:rPr>
+          <w:rFonts w:hint="default" w:ascii="Calibri" w:hAnsi="Calibri" w:cs="Calibri"/>
+          <w:sz w:val="22"/>
+          <w:szCs w:val="22"/>
+        </w:rPr>
+        <w:t xml:space="preserve"> using </w:t>
+      </w:r>
+      <w:r>
+        <w:rPr>
+          <w:rFonts w:hint="default" w:ascii="Calibri" w:hAnsi="Calibri" w:cs="Calibri"/>
+          <w:b/>
+          <w:bCs/>
+          <w:sz w:val="22"/>
+          <w:szCs w:val="22"/>
+          <w:lang w:val="en-US"/>
+        </w:rPr>
+        <w:t xml:space="preserve">Agentic AI powered </w:t>
+      </w:r>
+      <w:r>
+        <w:rPr>
+          <w:rFonts w:hint="default" w:ascii="Calibri" w:hAnsi="Calibri" w:cs="Calibri"/>
+          <w:b/>
+          <w:bCs/>
+          <w:sz w:val="22"/>
+          <w:szCs w:val="22"/>
+        </w:rPr>
+        <w:t>KIRO IDE</w:t>
+      </w:r>
+      <w:r>
+        <w:rPr>
+          <w:rFonts w:hint="default" w:ascii="Calibri" w:hAnsi="Calibri" w:cs="Calibri"/>
+          <w:sz w:val="22"/>
+          <w:szCs w:val="22"/>
+        </w:rPr>
+        <w:t xml:space="preserve"> to automate the initial assessment of raw datasets, reducing the time spent on manual data discovery by over 40%.</w:t>
       </w:r>
     </w:p>
     <w:p>
@@ -1091,87 +1120,46 @@
         <w:suppressLineNumbers w:val="0"/>
         <w:ind w:left="420" w:leftChars="0" w:hanging="420" w:firstLineChars="0"/>
         <w:rPr>
-          <w:rFonts w:asciiTheme="minorHAnsi" w:hAnsiTheme="minorHAnsi" w:eastAsiaTheme="minorHAnsi" w:cstheme="minorHAnsi"/>
-          <w:b/>
-          <w:bCs/>
-          <w:lang w:bidi="ar-SA"/>
-        </w:rPr>
-      </w:pPr>
-      <w:r>
-        <w:rPr>
-          <w:rFonts w:hint="default" w:ascii="Calibri" w:hAnsi="Calibri" w:cs="Calibri"/>
-          <w:b/>
-          <w:bCs/>
-          <w:sz w:val="22"/>
-          <w:szCs w:val="22"/>
-        </w:rPr>
-        <w:t>Architected advanced predictive models</w:t>
-      </w:r>
-      <w:r>
-        <w:rPr>
-          <w:rFonts w:hint="default" w:ascii="Calibri" w:hAnsi="Calibri" w:cs="Calibri"/>
-          <w:b/>
-          <w:bCs/>
-          <w:sz w:val="22"/>
-          <w:szCs w:val="22"/>
-          <w:lang w:val="en-US"/>
-        </w:rPr>
-        <w:t xml:space="preserve"> (SARIMA</w:t>
-      </w:r>
-      <w:bookmarkStart w:id="0" w:name="_GoBack"/>
-      <w:bookmarkEnd w:id="0"/>
-      <w:r>
-        <w:rPr>
-          <w:rFonts w:hint="default" w:ascii="Calibri" w:hAnsi="Calibri" w:cs="Calibri"/>
-          <w:b/>
-          <w:bCs/>
-          <w:sz w:val="22"/>
-          <w:szCs w:val="22"/>
-          <w:lang w:val="en-US"/>
-        </w:rPr>
-        <w:t>)</w:t>
-      </w:r>
-      <w:r>
-        <w:rPr>
-          <w:rFonts w:hint="default" w:ascii="Calibri" w:hAnsi="Calibri" w:cs="Calibri"/>
-          <w:sz w:val="22"/>
-          <w:szCs w:val="22"/>
-        </w:rPr>
-        <w:t xml:space="preserve"> to forecast </w:t>
-      </w:r>
-      <w:r>
-        <w:rPr>
-          <w:rFonts w:hint="default" w:ascii="Calibri" w:hAnsi="Calibri" w:cs="Calibri"/>
-          <w:sz w:val="22"/>
-          <w:szCs w:val="22"/>
-          <w:lang w:val="en-US"/>
-        </w:rPr>
-        <w:t>truck rolls for customers</w:t>
-      </w:r>
-      <w:r>
-        <w:rPr>
-          <w:rFonts w:hint="default" w:ascii="Calibri" w:hAnsi="Calibri" w:cs="Calibri"/>
-          <w:sz w:val="22"/>
-          <w:szCs w:val="22"/>
-        </w:rPr>
-        <w:t xml:space="preserve">, optimizing workforce capacity planning and reducing response times by </w:t>
-      </w:r>
-      <w:r>
-        <w:rPr>
-          <w:rFonts w:hint="default" w:ascii="Calibri" w:hAnsi="Calibri" w:cs="Calibri"/>
-          <w:sz w:val="22"/>
-          <w:szCs w:val="22"/>
-          <w:lang w:val="en-US"/>
-        </w:rPr>
-        <w:t>20</w:t>
-      </w:r>
-      <w:r>
-        <w:rPr>
-          <w:rFonts w:hint="default" w:ascii="Calibri" w:hAnsi="Calibri" w:cs="Calibri"/>
-          <w:sz w:val="22"/>
-          <w:szCs w:val="22"/>
-        </w:rPr>
-        <w:t>%.</w:t>
+          <w:rFonts w:hint="default" w:ascii="Calibri" w:hAnsi="Calibri" w:cs="Calibri"/>
+          <w:sz w:val="22"/>
+          <w:szCs w:val="22"/>
+        </w:rPr>
+      </w:pPr>
+      <w:r>
+        <w:rPr>
+          <w:rFonts w:hint="default" w:ascii="Calibri" w:hAnsi="Calibri" w:cs="Calibri"/>
+          <w:b/>
+          <w:bCs/>
+          <w:sz w:val="22"/>
+          <w:szCs w:val="22"/>
+        </w:rPr>
+        <w:t>Built and deployed XGBoost classification models</w:t>
+      </w:r>
+      <w:r>
+        <w:rPr>
+          <w:rFonts w:hint="default" w:ascii="Calibri" w:hAnsi="Calibri" w:cs="Calibri"/>
+          <w:sz w:val="22"/>
+          <w:szCs w:val="22"/>
+        </w:rPr>
+        <w:t xml:space="preserve"> to predict customer support-seeking behaviors and repair calls, contributing to a </w:t>
+      </w:r>
+      <w:r>
+        <w:rPr>
+          <w:rFonts w:hint="default" w:ascii="Calibri" w:hAnsi="Calibri" w:cs="Calibri"/>
+          <w:b/>
+          <w:bCs/>
+          <w:sz w:val="22"/>
+          <w:szCs w:val="22"/>
+        </w:rPr>
+        <w:t>20% improvement in service reliability.</w:t>
+      </w:r>
+      <w:r>
+        <w:rPr>
+          <w:rFonts w:hint="default" w:ascii="Calibri" w:hAnsi="Calibri" w:eastAsia="SimSun" w:cs="Calibri"/>
+          <w:sz w:val="22"/>
+          <w:szCs w:val="22"/>
+        </w:rPr>
+        <w:t xml:space="preserve">  </w:t>
       </w:r>
     </w:p>
     <w:p>
@@ -1187,75 +1175,58 @@
         <w:suppressLineNumbers w:val="0"/>
         <w:ind w:left="420" w:leftChars="0" w:hanging="420" w:firstLineChars="0"/>
         <w:rPr>
-          <w:rFonts w:hint="default" w:ascii="Calibri" w:hAnsi="Calibri" w:cs="Calibri"/>
-          <w:b w:val="0"/>
-          <w:bCs w:val="0"/>
-          <w:sz w:val="22"/>
-          <w:szCs w:val="22"/>
-        </w:rPr>
-      </w:pPr>
-      <w:r>
-        <w:rPr>
-          <w:rFonts w:hint="default" w:ascii="Calibri" w:hAnsi="Calibri" w:cs="Calibri"/>
-          <w:b/>
-          <w:bCs/>
-          <w:sz w:val="22"/>
-          <w:szCs w:val="22"/>
-        </w:rPr>
-        <w:t>Engineered an automated testing framework for SpectrumIQ</w:t>
-      </w:r>
-      <w:r>
-        <w:rPr>
-          <w:rFonts w:hint="default" w:ascii="Calibri" w:hAnsi="Calibri" w:cs="Calibri"/>
-          <w:b w:val="0"/>
-          <w:bCs w:val="0"/>
-          <w:sz w:val="22"/>
-          <w:szCs w:val="22"/>
-        </w:rPr>
-        <w:t xml:space="preserve">, an enterprise-wide conversational AI platform, reducing manual QA turnaround time by </w:t>
-      </w:r>
-      <w:r>
-        <w:rPr>
-          <w:rFonts w:hint="default" w:ascii="Calibri" w:hAnsi="Calibri" w:cs="Calibri"/>
-          <w:b w:val="0"/>
-          <w:bCs w:val="0"/>
+          <w:rFonts w:asciiTheme="minorHAnsi" w:hAnsiTheme="minorHAnsi" w:eastAsiaTheme="minorHAnsi" w:cstheme="minorHAnsi"/>
+          <w:b/>
+          <w:bCs/>
+          <w:lang w:bidi="ar-SA"/>
+        </w:rPr>
+      </w:pPr>
+      <w:r>
+        <w:rPr>
+          <w:rFonts w:hint="default" w:ascii="Calibri" w:hAnsi="Calibri" w:cs="Calibri"/>
+          <w:b/>
+          <w:bCs/>
           <w:sz w:val="22"/>
           <w:szCs w:val="22"/>
           <w:lang w:val="en-US"/>
         </w:rPr>
-        <w:t>50</w:t>
-      </w:r>
-      <w:r>
-        <w:rPr>
-          <w:rFonts w:hint="default" w:ascii="Calibri" w:hAnsi="Calibri" w:cs="Calibri"/>
-          <w:b w:val="0"/>
-          <w:bCs w:val="0"/>
-          <w:sz w:val="22"/>
-          <w:szCs w:val="22"/>
-        </w:rPr>
-        <w:t>% and accelerating release cycles.</w:t>
-      </w:r>
-    </w:p>
-    <w:p>
-      <w:pPr>
-        <w:widowControl/>
-        <w:adjustRightInd w:val="0"/>
-        <w:ind w:left="139"/>
-        <w:rPr>
-          <w:rFonts w:hint="default" w:asciiTheme="minorHAnsi" w:hAnsiTheme="minorHAnsi" w:eastAsiaTheme="minorHAnsi" w:cstheme="minorHAnsi"/>
-          <w:b/>
-          <w:bCs/>
-          <w:lang w:val="en-US" w:bidi="ar-SA"/>
-        </w:rPr>
-      </w:pPr>
-      <w:r>
-        <w:rPr>
-          <w:rFonts w:hint="default" w:asciiTheme="minorHAnsi" w:hAnsiTheme="minorHAnsi" w:eastAsiaTheme="minorHAnsi" w:cstheme="minorHAnsi"/>
-          <w:b/>
-          <w:bCs/>
-          <w:lang w:val="en-US" w:bidi="ar-SA"/>
-        </w:rPr>
-        <w:t>ETL Developer</w:t>
+        <w:t>En</w:t>
+      </w:r>
+      <w:r>
+        <w:rPr>
+          <w:rFonts w:hint="default" w:ascii="Calibri" w:hAnsi="Calibri" w:cs="Calibri"/>
+          <w:b/>
+          <w:bCs/>
+          <w:sz w:val="22"/>
+          <w:szCs w:val="22"/>
+        </w:rPr>
+        <w:t>gineered and deployed an autonomous AI anomaly detection framework</w:t>
+      </w:r>
+      <w:r>
+        <w:rPr>
+          <w:rFonts w:hint="default" w:ascii="Calibri" w:hAnsi="Calibri" w:cs="Calibri"/>
+          <w:sz w:val="22"/>
+          <w:szCs w:val="22"/>
+        </w:rPr>
+        <w:t xml:space="preserve">, identifying schema variations and data drift with </w:t>
+      </w:r>
+      <w:r>
+        <w:rPr>
+          <w:rFonts w:hint="default" w:ascii="Calibri" w:hAnsi="Calibri" w:cs="Calibri"/>
+          <w:b/>
+          <w:bCs/>
+          <w:sz w:val="22"/>
+          <w:szCs w:val="22"/>
+        </w:rPr>
+        <w:t>95% precision</w:t>
+      </w:r>
+      <w:r>
+        <w:rPr>
+          <w:rFonts w:hint="default" w:ascii="Calibri" w:hAnsi="Calibri" w:cs="Calibri"/>
+          <w:sz w:val="22"/>
+          <w:szCs w:val="22"/>
+        </w:rPr>
+        <w:t xml:space="preserve"> to safeguard downstream enterprise BI pipeline integrity.</w:t>
       </w:r>
     </w:p>
     <w:p>
@@ -1271,28 +1242,126 @@
         <w:suppressLineNumbers w:val="0"/>
         <w:ind w:left="420" w:leftChars="0" w:hanging="420" w:firstLineChars="0"/>
         <w:rPr>
-          <w:rFonts w:hint="default" w:ascii="Calibri" w:hAnsi="Calibri" w:cs="Calibri"/>
-          <w:sz w:val="22"/>
-          <w:szCs w:val="22"/>
-        </w:rPr>
-      </w:pPr>
-      <w:r>
-        <w:rPr>
-          <w:rFonts w:hint="default" w:ascii="Calibri" w:hAnsi="Calibri" w:eastAsia="SimSun" w:cs="Calibri"/>
-          <w:b/>
-          <w:bCs/>
-          <w:sz w:val="22"/>
-          <w:szCs w:val="22"/>
-        </w:rPr>
-        <w:t>Architected a modular Data Quality Audit framework</w:t>
-      </w:r>
-      <w:r>
-        <w:rPr>
-          <w:rFonts w:hint="default" w:ascii="Calibri" w:hAnsi="Calibri" w:eastAsia="SimSun" w:cs="Calibri"/>
-          <w:sz w:val="22"/>
-          <w:szCs w:val="22"/>
-        </w:rPr>
-        <w:t xml:space="preserve"> that enables the seamless integration of new audit logic, creating a scalable and maintainable suite that serves as the organization’s primary data integrity engine.</w:t>
+          <w:rFonts w:asciiTheme="minorHAnsi" w:hAnsiTheme="minorHAnsi" w:eastAsiaTheme="minorHAnsi" w:cstheme="minorHAnsi"/>
+          <w:b/>
+          <w:bCs/>
+          <w:lang w:bidi="ar-SA"/>
+        </w:rPr>
+      </w:pPr>
+      <w:r>
+        <w:rPr>
+          <w:rFonts w:hint="default" w:ascii="Calibri" w:hAnsi="Calibri" w:cs="Calibri"/>
+          <w:b/>
+          <w:bCs/>
+          <w:sz w:val="22"/>
+          <w:szCs w:val="22"/>
+        </w:rPr>
+        <w:t>Architected advanced predictive models</w:t>
+      </w:r>
+      <w:r>
+        <w:rPr>
+          <w:rFonts w:hint="default" w:ascii="Calibri" w:hAnsi="Calibri" w:cs="Calibri"/>
+          <w:b/>
+          <w:bCs/>
+          <w:sz w:val="22"/>
+          <w:szCs w:val="22"/>
+          <w:lang w:val="en-US"/>
+        </w:rPr>
+        <w:t xml:space="preserve"> (SARIMA)</w:t>
+      </w:r>
+      <w:r>
+        <w:rPr>
+          <w:rFonts w:hint="default" w:ascii="Calibri" w:hAnsi="Calibri" w:cs="Calibri"/>
+          <w:sz w:val="22"/>
+          <w:szCs w:val="22"/>
+        </w:rPr>
+        <w:t xml:space="preserve"> to forecast </w:t>
+      </w:r>
+      <w:r>
+        <w:rPr>
+          <w:rFonts w:hint="default" w:ascii="Calibri" w:hAnsi="Calibri" w:cs="Calibri"/>
+          <w:sz w:val="22"/>
+          <w:szCs w:val="22"/>
+          <w:lang w:val="en-US"/>
+        </w:rPr>
+        <w:t>truck rolls for customers</w:t>
+      </w:r>
+      <w:r>
+        <w:rPr>
+          <w:rFonts w:hint="default" w:ascii="Calibri" w:hAnsi="Calibri" w:cs="Calibri"/>
+          <w:sz w:val="22"/>
+          <w:szCs w:val="22"/>
+        </w:rPr>
+        <w:t xml:space="preserve">, optimizing workforce capacity planning and </w:t>
+      </w:r>
+      <w:r>
+        <w:rPr>
+          <w:rFonts w:hint="default" w:ascii="Calibri" w:hAnsi="Calibri" w:cs="Calibri"/>
+          <w:b/>
+          <w:bCs/>
+          <w:sz w:val="22"/>
+          <w:szCs w:val="22"/>
+        </w:rPr>
+        <w:t xml:space="preserve">reducing response times by </w:t>
+      </w:r>
+      <w:r>
+        <w:rPr>
+          <w:rFonts w:hint="default" w:ascii="Calibri" w:hAnsi="Calibri" w:cs="Calibri"/>
+          <w:b/>
+          <w:bCs/>
+          <w:sz w:val="22"/>
+          <w:szCs w:val="22"/>
+          <w:lang w:val="en-US"/>
+        </w:rPr>
+        <w:t>20</w:t>
+      </w:r>
+      <w:r>
+        <w:rPr>
+          <w:rFonts w:hint="default" w:ascii="Calibri" w:hAnsi="Calibri" w:cs="Calibri"/>
+          <w:b/>
+          <w:bCs/>
+          <w:sz w:val="22"/>
+          <w:szCs w:val="22"/>
+        </w:rPr>
+        <w:t>%</w:t>
+      </w:r>
+      <w:r>
+        <w:rPr>
+          <w:rFonts w:hint="default" w:ascii="Calibri" w:hAnsi="Calibri" w:cs="Calibri"/>
+          <w:sz w:val="22"/>
+          <w:szCs w:val="22"/>
+        </w:rPr>
+        <w:t>.</w:t>
+      </w:r>
+    </w:p>
+    <w:p>
+      <w:pPr>
+        <w:widowControl/>
+        <w:adjustRightInd w:val="0"/>
+        <w:ind w:left="139"/>
+        <w:rPr>
+          <w:rFonts w:hint="default" w:ascii="Calibri" w:hAnsi="Calibri" w:cs="Calibri"/>
+          <w:sz w:val="22"/>
+          <w:szCs w:val="22"/>
+        </w:rPr>
+      </w:pPr>
+      <w:r>
+        <w:rPr>
+          <w:rFonts w:hint="default" w:asciiTheme="minorHAnsi" w:hAnsiTheme="minorHAnsi" w:eastAsiaTheme="minorHAnsi" w:cstheme="minorHAnsi"/>
+          <w:b/>
+          <w:bCs/>
+          <w:lang w:val="en-US" w:bidi="ar-SA"/>
+        </w:rPr>
+        <w:t>ETL Developer</w:t>
+      </w:r>
+      <w:r>
+        <w:rPr>
+          <w:rFonts w:hint="default" w:ascii="Calibri" w:hAnsi="Calibri" w:cs="Calibri"/>
+          <w:sz w:val="22"/>
+          <w:szCs w:val="22"/>
+          <w:lang w:val="en-US"/>
+        </w:rPr>
+        <w:t xml:space="preserve"> </w:t>
       </w:r>
     </w:p>
     <w:p>
@@ -1315,21 +1384,21 @@
       </w:pPr>
       <w:r>
         <w:rPr>
-          <w:rFonts w:hint="default" w:ascii="Calibri" w:hAnsi="Calibri" w:cs="Calibri"/>
-          <w:b/>
-          <w:bCs/>
-          <w:sz w:val="22"/>
-          <w:szCs w:val="22"/>
-        </w:rPr>
-        <w:t>Engineered comprehensive Data Quality dashboards</w:t>
-      </w:r>
-      <w:r>
-        <w:rPr>
-          <w:rFonts w:hint="default" w:ascii="Calibri" w:hAnsi="Calibri" w:cs="Calibri"/>
-          <w:sz w:val="22"/>
-          <w:szCs w:val="22"/>
-        </w:rPr>
-        <w:t xml:space="preserve"> to facilitate a seamless migration of BI assets from Teradata to AWS Redshift, maintaining 100% data integrity during the transition.</w:t>
+          <w:rFonts w:hint="default" w:ascii="Calibri" w:hAnsi="Calibri" w:eastAsia="SimSun" w:cs="Calibri"/>
+          <w:b/>
+          <w:bCs/>
+          <w:sz w:val="22"/>
+          <w:szCs w:val="22"/>
+        </w:rPr>
+        <w:t>Architected a modular Data Quality Audit framework</w:t>
+      </w:r>
+      <w:r>
+        <w:rPr>
+          <w:rFonts w:hint="default" w:ascii="Calibri" w:hAnsi="Calibri" w:eastAsia="SimSun" w:cs="Calibri"/>
+          <w:sz w:val="22"/>
+          <w:szCs w:val="22"/>
+        </w:rPr>
+        <w:t xml:space="preserve"> that enables the seamless integration of new audit logic, creating a scalable and maintainable suite that serves as the organization’s primary data integrity engine.</w:t>
       </w:r>
     </w:p>
     <w:p>
@@ -1345,47 +1414,28 @@
         <w:suppressLineNumbers w:val="0"/>
         <w:ind w:left="420" w:leftChars="0" w:hanging="420" w:firstLineChars="0"/>
         <w:rPr>
-          <w:rFonts w:asciiTheme="minorHAnsi" w:hAnsiTheme="minorHAnsi" w:eastAsiaTheme="minorHAnsi" w:cstheme="minorHAnsi"/>
-          <w:b/>
-          <w:bCs/>
-          <w:lang w:bidi="ar-SA"/>
-        </w:rPr>
-      </w:pPr>
-      <w:r>
-        <w:rPr>
-          <w:rFonts w:hint="default" w:ascii="Calibri" w:hAnsi="Calibri" w:eastAsia="SimSun" w:cs="Calibri"/>
-          <w:b/>
-          <w:bCs/>
-          <w:sz w:val="22"/>
-          <w:szCs w:val="22"/>
-        </w:rPr>
-        <w:t>Engineered an automated, notification-driven Data Quality Audit framework</w:t>
-      </w:r>
-      <w:r>
-        <w:rPr>
-          <w:rFonts w:hint="default" w:ascii="Calibri" w:hAnsi="Calibri" w:eastAsia="SimSun" w:cs="Calibri"/>
-          <w:sz w:val="22"/>
-          <w:szCs w:val="22"/>
-        </w:rPr>
-        <w:t xml:space="preserve"> that streamlined short-term validation cycles; reduced operational turnaround time by </w:t>
-      </w:r>
-      <w:r>
-        <w:rPr>
-          <w:rFonts w:hint="default" w:ascii="Calibri" w:hAnsi="Calibri" w:eastAsia="SimSun" w:cs="Calibri"/>
-          <w:b/>
-          <w:bCs/>
-          <w:sz w:val="22"/>
-          <w:szCs w:val="22"/>
-        </w:rPr>
-        <w:t>over 80%</w:t>
-      </w:r>
-      <w:r>
-        <w:rPr>
-          <w:rFonts w:hint="default" w:ascii="Calibri" w:hAnsi="Calibri" w:eastAsia="SimSun" w:cs="Calibri"/>
-          <w:sz w:val="22"/>
-          <w:szCs w:val="22"/>
-        </w:rPr>
-        <w:t xml:space="preserve"> while ensuring real-time data reliability.</w:t>
+          <w:rFonts w:hint="default" w:ascii="Calibri" w:hAnsi="Calibri" w:cs="Calibri"/>
+          <w:sz w:val="22"/>
+          <w:szCs w:val="22"/>
+        </w:rPr>
+      </w:pPr>
+      <w:r>
+        <w:rPr>
+          <w:rFonts w:hint="default" w:ascii="Calibri" w:hAnsi="Calibri" w:cs="Calibri"/>
+          <w:b/>
+          <w:bCs/>
+          <w:sz w:val="22"/>
+          <w:szCs w:val="22"/>
+        </w:rPr>
+        <w:t>Engineered comprehensive Data Quality dashboards</w:t>
+      </w:r>
+      <w:r>
+        <w:rPr>
+          <w:rFonts w:hint="default" w:ascii="Calibri" w:hAnsi="Calibri" w:cs="Calibri"/>
+          <w:sz w:val="22"/>
+          <w:szCs w:val="22"/>
+        </w:rPr>
+        <w:t xml:space="preserve"> to facilitate a seamless migration of BI assets from Teradata to AWS Redshift, maintaining 100% data integrity during the transition.</w:t>
       </w:r>
     </w:p>
     <w:p>
@@ -1401,68 +1451,49 @@
         <w:suppressLineNumbers w:val="0"/>
         <w:ind w:left="420" w:leftChars="0" w:hanging="420" w:firstLineChars="0"/>
         <w:rPr>
-          <w:rFonts w:asciiTheme="minorHAnsi" w:hAnsiTheme="minorHAnsi" w:eastAsiaTheme="minorHAnsi" w:cstheme="minorHAnsi"/>
-          <w:b/>
-          <w:bCs/>
-          <w:lang w:bidi="ar-SA"/>
-        </w:rPr>
-      </w:pPr>
-      <w:r>
-        <w:rPr>
-          <w:rFonts w:hint="default" w:ascii="Calibri" w:hAnsi="Calibri" w:cs="Calibri"/>
-          <w:b/>
-          <w:bCs/>
-          <w:sz w:val="22"/>
-          <w:szCs w:val="22"/>
-        </w:rPr>
-        <w:t>Engineered a custom Data Profiler tool</w:t>
-      </w:r>
-      <w:r>
-        <w:rPr>
-          <w:rFonts w:hint="default" w:ascii="Calibri" w:hAnsi="Calibri" w:cs="Calibri"/>
-          <w:sz w:val="22"/>
-          <w:szCs w:val="22"/>
-        </w:rPr>
-        <w:t xml:space="preserve"> using </w:t>
-      </w:r>
-      <w:r>
-        <w:rPr>
-          <w:rFonts w:hint="default" w:ascii="Calibri" w:hAnsi="Calibri" w:cs="Calibri"/>
-          <w:b/>
-          <w:bCs/>
-          <w:sz w:val="22"/>
-          <w:szCs w:val="22"/>
-          <w:lang w:val="en-US"/>
-        </w:rPr>
-        <w:t xml:space="preserve">Agentic AI powered </w:t>
-      </w:r>
-      <w:r>
-        <w:rPr>
-          <w:rFonts w:hint="default" w:ascii="Calibri" w:hAnsi="Calibri" w:cs="Calibri"/>
-          <w:b/>
-          <w:bCs/>
-          <w:sz w:val="22"/>
-          <w:szCs w:val="22"/>
-        </w:rPr>
-        <w:t>KIRO IDE</w:t>
-      </w:r>
-      <w:r>
-        <w:rPr>
-          <w:rFonts w:hint="default" w:ascii="Calibri" w:hAnsi="Calibri" w:cs="Calibri"/>
-          <w:sz w:val="22"/>
-          <w:szCs w:val="22"/>
-        </w:rPr>
-        <w:t xml:space="preserve"> to automate the initial assessment of raw datasets, reducing the time spent on manual data discovery by over 40%. </w:t>
-      </w:r>
-      <w:r>
-        <w:rPr>
-          <w:rFonts w:hint="default" w:ascii="Calibri" w:hAnsi="Calibri" w:cs="Calibri"/>
-          <w:sz w:val="22"/>
-          <w:szCs w:val="22"/>
-          <w:lang w:val="en-US"/>
-        </w:rPr>
-        <w:t xml:space="preserve"> </w:t>
-      </w:r>
+          <w:rFonts w:hint="default" w:ascii="Calibri" w:hAnsi="Calibri" w:eastAsia="SimSun" w:cs="Calibri"/>
+          <w:sz w:val="22"/>
+          <w:szCs w:val="22"/>
+        </w:rPr>
+      </w:pPr>
+      <w:r>
+        <w:rPr>
+          <w:rFonts w:hint="default" w:ascii="Calibri" w:hAnsi="Calibri" w:eastAsia="SimSun" w:cs="Calibri"/>
+          <w:b/>
+          <w:bCs/>
+          <w:sz w:val="22"/>
+          <w:szCs w:val="22"/>
+        </w:rPr>
+        <w:t>Engineered an automated, notification-driven Data Quality Audit framework</w:t>
+      </w:r>
+      <w:r>
+        <w:rPr>
+          <w:rFonts w:hint="default" w:ascii="Calibri" w:hAnsi="Calibri" w:eastAsia="SimSun" w:cs="Calibri"/>
+          <w:sz w:val="22"/>
+          <w:szCs w:val="22"/>
+        </w:rPr>
+        <w:t xml:space="preserve"> that streamlined short-term validation cycles; reduced operational turnaround time by </w:t>
+      </w:r>
+      <w:r>
+        <w:rPr>
+          <w:rFonts w:hint="default" w:ascii="Calibri" w:hAnsi="Calibri" w:eastAsia="SimSun" w:cs="Calibri"/>
+          <w:b/>
+          <w:bCs/>
+          <w:sz w:val="22"/>
+          <w:szCs w:val="22"/>
+        </w:rPr>
+        <w:t>over 80%</w:t>
+      </w:r>
+      <w:r>
+        <w:rPr>
+          <w:rFonts w:hint="default" w:ascii="Calibri" w:hAnsi="Calibri" w:eastAsia="SimSun" w:cs="Calibri"/>
+          <w:sz w:val="22"/>
+          <w:szCs w:val="22"/>
+        </w:rPr>
+        <w:t xml:space="preserve"> while ensuring real-time data reliability.</w:t>
+      </w:r>
+      <w:bookmarkStart w:id="0" w:name="_GoBack"/>
+      <w:bookmarkEnd w:id="0"/>
     </w:p>
     <w:p>
       <w:pPr>

</xml_diff>